<commit_message>
跨平台适配 Windows 11 + GitHub Actions 出 Windows 安装包
代码跨平台：
- git-sync/transcriber：PATH 用 path.delimiter，按平台补 git/whisper 路径，
  which/where 兜底找 PATH 上的可执行文件
- gzh 排版：改用内置 Electron 运行时(ELECTRON_RUN_AS_NODE)，Windows 免装 Node
- tender-download：非 macOS 优雅降级为手动下载提示，不再 spawn 不存在的可执行文件

打包：
- 新增 .github/workflows/build-windows.yml：windows-latest 上 npm ci + build:win，
  产物传 Artifacts，打 v* 标签时发 Release
- Windows 安装使用说明同步更新（获取安装包的两种方式、平台差异刷新）

Co-Authored-By: Claude Opus 4.8 <noreply@anthropic.com>
</commit_message>
<xml_diff>
--- a/docs/炬视工作台_Windows安装使用说明.docx
+++ b/docs/炬视工作台_Windows安装使用说明.docx
@@ -106,7 +106,143 @@
         <w:spacing w:after="120"/>
       </w:pPr>
       <w:r>
-        <w:t xml:space="preserve">它由管理员在一台 Windows 电脑上打包生成（打包方法见同目录 `打包Windows说明.md`）。你只需拿到这个 `.exe` 即可，</w:t>
+        <w:rPr>
+          <w:b/>
+          <w:bCs/>
+        </w:rPr>
+        <w:t xml:space="preserve">怎么拿到它（管理员，任选其一）</w:t>
+      </w:r>
+      <w:r>
+        <w:t xml:space="preserve">：</w:t>
+      </w:r>
+    </w:p>
+    <w:p/>
+    <w:p>
+      <w:pPr>
+        <w:pStyle w:val="ListParagraph"/>
+        <w:numPr>
+          <w:ilvl w:val="0"/>
+          <w:numId w:val="2"/>
+        </w:numPr>
+      </w:pPr>
+      <w:r>
+        <w:rPr>
+          <w:b/>
+          <w:bCs/>
+        </w:rPr>
+        <w:t xml:space="preserve">方式 A（推荐，云端自动打包）</w:t>
+      </w:r>
+      <w:r>
+        <w:t xml:space="preserve">：仓库已配好 GitHub Actions。打开仓库</w:t>
+      </w:r>
+    </w:p>
+    <w:p>
+      <w:pPr>
+        <w:spacing w:after="120"/>
+      </w:pPr>
+      <w:r>
+        <w:t xml:space="preserve">  `xjwhangdian-ai/company-os-desktop` → </w:t>
+      </w:r>
+      <w:r>
+        <w:rPr>
+          <w:b/>
+          <w:bCs/>
+        </w:rPr>
+        <w:t xml:space="preserve">Actions</w:t>
+      </w:r>
+      <w:r>
+        <w:t xml:space="preserve"> 标签 → 左侧「Build Windows Installer」</w:t>
+      </w:r>
+    </w:p>
+    <w:p>
+      <w:pPr>
+        <w:spacing w:after="120"/>
+      </w:pPr>
+      <w:r>
+        <w:t xml:space="preserve">  → 「Run workflow」。几分钟后在这次运行页面底部 </w:t>
+      </w:r>
+      <w:r>
+        <w:rPr>
+          <w:b/>
+          <w:bCs/>
+        </w:rPr>
+        <w:t xml:space="preserve">Artifacts</w:t>
+      </w:r>
+      <w:r>
+        <w:t xml:space="preserve"> 里下载 `windows-installer`</w:t>
+      </w:r>
+    </w:p>
+    <w:p>
+      <w:pPr>
+        <w:spacing w:after="120"/>
+      </w:pPr>
+      <w:r>
+        <w:t xml:space="preserve">  （解压得到 `.exe`）。</w:t>
+      </w:r>
+    </w:p>
+    <w:p>
+      <w:pPr>
+        <w:pStyle w:val="ListParagraph"/>
+        <w:numPr>
+          <w:ilvl w:val="0"/>
+          <w:numId w:val="2"/>
+        </w:numPr>
+      </w:pPr>
+      <w:r>
+        <w:t xml:space="preserve">也可以打版本标签自动出包并发到 Release：本地 `git tag v0.1.0 &amp;&amp; git push origin v0.1.0`，</w:t>
+      </w:r>
+    </w:p>
+    <w:p>
+      <w:pPr>
+        <w:spacing w:after="120"/>
+      </w:pPr>
+      <w:r>
+        <w:t xml:space="preserve">    构建完成后到仓库 </w:t>
+      </w:r>
+      <w:r>
+        <w:rPr>
+          <w:b/>
+          <w:bCs/>
+        </w:rPr>
+        <w:t xml:space="preserve">Releases</w:t>
+      </w:r>
+      <w:r>
+        <w:t xml:space="preserve"> 页下载。</w:t>
+      </w:r>
+    </w:p>
+    <w:p>
+      <w:pPr>
+        <w:pStyle w:val="ListParagraph"/>
+        <w:numPr>
+          <w:ilvl w:val="0"/>
+          <w:numId w:val="2"/>
+        </w:numPr>
+      </w:pPr>
+      <w:r>
+        <w:rPr>
+          <w:b/>
+          <w:bCs/>
+        </w:rPr>
+        <w:t xml:space="preserve">方式 B（本地 Windows 电脑打包）</w:t>
+      </w:r>
+      <w:r>
+        <w:t xml:space="preserve">：见同目录 `打包Windows说明.md`。</w:t>
+      </w:r>
+    </w:p>
+    <w:p/>
+    <w:p>
+      <w:pPr>
+        <w:spacing w:after="120"/>
+      </w:pPr>
+      <w:r>
+        <w:rPr>
+          <w:b/>
+          <w:bCs/>
+        </w:rPr>
+        <w:t xml:space="preserve">普通员工</w:t>
+      </w:r>
+      <w:r>
+        <w:t xml:space="preserve">只需拿到管理员给的这个 `.exe` 即可，</w:t>
       </w:r>
       <w:r>
         <w:rPr>
@@ -146,58 +282,70 @@
         <w:pStyle w:val="ListParagraph"/>
         <w:numPr>
           <w:ilvl w:val="0"/>
+          <w:numId w:val="3"/>
+        </w:numPr>
+      </w:pPr>
+      <w:r>
+        <w:t xml:space="preserve">双击 `炬视数字人分身工作台 Setup x.x.x.exe`。</w:t>
+      </w:r>
+    </w:p>
+    <w:p>
+      <w:pPr>
+        <w:pStyle w:val="ListParagraph"/>
+        <w:numPr>
+          <w:ilvl w:val="0"/>
+          <w:numId w:val="3"/>
+        </w:numPr>
+      </w:pPr>
+      <w:r>
+        <w:rPr>
+          <w:b/>
+          <w:bCs/>
+        </w:rPr>
+        <w:t xml:space="preserve">会弹出蓝色提示「Windows 已保护你的电脑 / 未知发布者」</w:t>
+      </w:r>
+      <w:r>
+        <w:t xml:space="preserve">——这是因为安装包</w:t>
+      </w:r>
+      <w:r>
+        <w:rPr>
+          <w:b/>
+          <w:bCs/>
+        </w:rPr>
+        <w:t xml:space="preserve">未做代码签名</w:t>
+      </w:r>
+      <w:r>
+        <w:t xml:space="preserve">，属正常现象。</w:t>
+      </w:r>
+    </w:p>
+    <w:p>
+      <w:pPr>
+        <w:spacing w:after="120"/>
+      </w:pPr>
+      <w:r>
+        <w:t xml:space="preserve">   点提示里的 </w:t>
+      </w:r>
+      <w:r>
+        <w:rPr>
+          <w:b/>
+          <w:bCs/>
+        </w:rPr>
+        <w:t xml:space="preserve">「更多信息」→「仍要运行」</w:t>
+      </w:r>
+      <w:r>
+        <w:t xml:space="preserve"> 即可继续。</w:t>
+      </w:r>
+    </w:p>
+    <w:p>
+      <w:pPr>
+        <w:pStyle w:val="ListParagraph"/>
+        <w:numPr>
+          <w:ilvl w:val="0"/>
           <w:numId w:val="2"/>
         </w:numPr>
       </w:pPr>
       <w:r>
-        <w:t xml:space="preserve">双击 `炬视数字人分身工作台 Setup x.x.x.exe`。</w:t>
-      </w:r>
-    </w:p>
-    <w:p>
-      <w:pPr>
-        <w:pStyle w:val="ListParagraph"/>
-        <w:numPr>
-          <w:ilvl w:val="0"/>
-          <w:numId w:val="2"/>
-        </w:numPr>
-      </w:pPr>
-      <w:r>
-        <w:rPr>
-          <w:b/>
-          <w:bCs/>
-        </w:rPr>
-        <w:t xml:space="preserve">会弹出蓝色提示「Windows 已保护你的电脑 / 未知发布者」</w:t>
-      </w:r>
-      <w:r>
-        <w:t xml:space="preserve">——这是因为安装包</w:t>
-      </w:r>
-      <w:r>
-        <w:rPr>
-          <w:b/>
-          <w:bCs/>
-        </w:rPr>
-        <w:t xml:space="preserve">未做代码签名</w:t>
-      </w:r>
-      <w:r>
-        <w:t xml:space="preserve">，属正常现象。</w:t>
-      </w:r>
-    </w:p>
-    <w:p>
-      <w:pPr>
-        <w:spacing w:after="120"/>
-      </w:pPr>
-      <w:r>
-        <w:t xml:space="preserve">   点提示里的 </w:t>
-      </w:r>
-      <w:r>
-        <w:rPr>
-          <w:b/>
-          <w:bCs/>
-        </w:rPr>
-        <w:t xml:space="preserve">「更多信息」→「仍要运行」</w:t>
-      </w:r>
-      <w:r>
-        <w:t xml:space="preserve"> 即可继续。</w:t>
+        <w:t xml:space="preserve">如果双击没反应或被杀毒拦截：右键该 `.exe`→「属性」→ 勾选「解除锁定」→ 确定，再运行。</w:t>
       </w:r>
     </w:p>
     <w:p>
@@ -209,18 +357,6 @@
         </w:numPr>
       </w:pPr>
       <w:r>
-        <w:t xml:space="preserve">如果双击没反应或被杀毒拦截：右键该 `.exe`→「属性」→ 勾选「解除锁定」→ 确定，再运行。</w:t>
-      </w:r>
-    </w:p>
-    <w:p>
-      <w:pPr>
-        <w:pStyle w:val="ListParagraph"/>
-        <w:numPr>
-          <w:ilvl w:val="0"/>
-          <w:numId w:val="2"/>
-        </w:numPr>
-      </w:pPr>
-      <w:r>
         <w:t xml:space="preserve">选择安装位置（可用默认），点「安装」。</w:t>
       </w:r>
     </w:p>
@@ -229,7 +365,7 @@
         <w:pStyle w:val="ListParagraph"/>
         <w:numPr>
           <w:ilvl w:val="0"/>
-          <w:numId w:val="2"/>
+          <w:numId w:val="3"/>
         </w:numPr>
       </w:pPr>
       <w:r>
@@ -251,7 +387,7 @@
         <w:pStyle w:val="ListParagraph"/>
         <w:numPr>
           <w:ilvl w:val="0"/>
-          <w:numId w:val="2"/>
+          <w:numId w:val="3"/>
         </w:numPr>
       </w:pPr>
       <w:r>
@@ -285,18 +421,30 @@
         <w:pStyle w:val="ListParagraph"/>
         <w:numPr>
           <w:ilvl w:val="0"/>
+          <w:numId w:val="3"/>
+        </w:numPr>
+      </w:pPr>
+      <w:r>
+        <w:rPr>
+          <w:b/>
+          <w:bCs/>
+        </w:rPr>
+        <w:t xml:space="preserve">选公司 → 选自己的名字</w:t>
+      </w:r>
+      <w:r>
+        <w:t xml:space="preserve">（可设 4 位 PIN；忘了找管理员重置）。</w:t>
+      </w:r>
+    </w:p>
+    <w:p>
+      <w:pPr>
+        <w:pStyle w:val="ListParagraph"/>
+        <w:numPr>
+          <w:ilvl w:val="0"/>
           <w:numId w:val="2"/>
         </w:numPr>
       </w:pPr>
       <w:r>
-        <w:rPr>
-          <w:b/>
-          <w:bCs/>
-        </w:rPr>
-        <w:t xml:space="preserve">选公司 → 选自己的名字</w:t>
-      </w:r>
-      <w:r>
-        <w:t xml:space="preserve">（可设 4 位 PIN；忘了找管理员重置）。</w:t>
+        <w:t xml:space="preserve">这只是给产出文件留「谁做的」痕迹，不是账号安全系统。</w:t>
       </w:r>
     </w:p>
     <w:p>
@@ -308,7 +456,22 @@
         </w:numPr>
       </w:pPr>
       <w:r>
-        <w:t xml:space="preserve">这只是给产出文件留「谁做的」痕迹，不是账号安全系统。</w:t>
+        <w:rPr>
+          <w:b/>
+          <w:bCs/>
+        </w:rPr>
+        <w:t xml:space="preserve">数据目录</w:t>
+      </w:r>
+      <w:r>
+        <w:t xml:space="preserve">（管理员配一次）：指向本机的 `company-os` 仓库文件夹，例如</w:t>
+      </w:r>
+    </w:p>
+    <w:p>
+      <w:pPr>
+        <w:spacing w:after="120"/>
+      </w:pPr>
+      <w:r>
+        <w:t xml:space="preserve">   `C:\Users\你的用户名\company-os`。里面应有 `knowledge\`、`outputs\`、`bidding\` 等子目录。</w:t>
       </w:r>
     </w:p>
     <w:p>
@@ -320,22 +483,7 @@
         </w:numPr>
       </w:pPr>
       <w:r>
-        <w:rPr>
-          <w:b/>
-          <w:bCs/>
-        </w:rPr>
-        <w:t xml:space="preserve">数据目录</w:t>
-      </w:r>
-      <w:r>
-        <w:t xml:space="preserve">（管理员配一次）：指向本机的 `company-os` 仓库文件夹，例如</w:t>
-      </w:r>
-    </w:p>
-    <w:p>
-      <w:pPr>
-        <w:spacing w:after="120"/>
-      </w:pPr>
-      <w:r>
-        <w:t xml:space="preserve">   `C:\Users\你的用户名\company-os`。里面应有 `knowledge\`、`outputs\`、`bidding\` 等子目录。</w:t>
+        <w:t xml:space="preserve">本机还没有这个文件夹？见下面第四节。</w:t>
       </w:r>
     </w:p>
     <w:p>
@@ -344,18 +492,6 @@
         <w:numPr>
           <w:ilvl w:val="0"/>
           <w:numId w:val="3"/>
-        </w:numPr>
-      </w:pPr>
-      <w:r>
-        <w:t xml:space="preserve">本机还没有这个文件夹？见下面第四节。</w:t>
-      </w:r>
-    </w:p>
-    <w:p>
-      <w:pPr>
-        <w:pStyle w:val="ListParagraph"/>
-        <w:numPr>
-          <w:ilvl w:val="0"/>
-          <w:numId w:val="2"/>
         </w:numPr>
       </w:pPr>
       <w:r>
@@ -424,7 +560,7 @@
         <w:pStyle w:val="ListParagraph"/>
         <w:numPr>
           <w:ilvl w:val="0"/>
-          <w:numId w:val="2"/>
+          <w:numId w:val="3"/>
         </w:numPr>
       </w:pPr>
       <w:r>
@@ -443,7 +579,7 @@
         <w:pStyle w:val="ListParagraph"/>
         <w:numPr>
           <w:ilvl w:val="0"/>
-          <w:numId w:val="2"/>
+          <w:numId w:val="3"/>
         </w:numPr>
       </w:pPr>
       <w:r>
@@ -490,7 +626,7 @@
         <w:pStyle w:val="ListParagraph"/>
         <w:numPr>
           <w:ilvl w:val="0"/>
-          <w:numId w:val="2"/>
+          <w:numId w:val="3"/>
         </w:numPr>
       </w:pPr>
       <w:r>
@@ -517,7 +653,7 @@
         <w:pStyle w:val="ListParagraph"/>
         <w:numPr>
           <w:ilvl w:val="0"/>
-          <w:numId w:val="2"/>
+          <w:numId w:val="3"/>
         </w:numPr>
       </w:pPr>
       <w:r>
@@ -539,7 +675,7 @@
         <w:pStyle w:val="ListParagraph"/>
         <w:numPr>
           <w:ilvl w:val="0"/>
-          <w:numId w:val="2"/>
+          <w:numId w:val="3"/>
         </w:numPr>
       </w:pPr>
       <w:r>
@@ -583,17 +719,7 @@
         <w:spacing w:after="120"/>
       </w:pPr>
       <w:r>
-        <w:t xml:space="preserve">大部分功能 Windows 完全可用，但</w:t>
-      </w:r>
-      <w:r>
-        <w:rPr>
-          <w:b/>
-          <w:bCs/>
-        </w:rPr>
-        <w:t xml:space="preserve">有几项目前是 Mac 管理员机专属</w:t>
-      </w:r>
-      <w:r>
-        <w:t xml:space="preserve">，Windows 上暂不可用。这不影响你手动处理已有文件，但要心里有数：</w:t>
+        <w:t xml:space="preserve">程序已做跨平台适配，Windows 11 上正常运行。少数依赖外部工具或特定环境的功能，情况如下：</w:t>
       </w:r>
     </w:p>
     <w:p/>
@@ -698,7 +824,7 @@
                 <w:b/>
                 <w:bCs/>
               </w:rPr>
-              <w:t xml:space="preserve">怎么办</w:t>
+              <w:t xml:space="preserve">说明</w:t>
             </w:r>
           </w:p>
         </w:tc>
@@ -726,7 +852,7 @@
           </w:tcPr>
           <w:p>
             <w:r>
-              <w:t xml:space="preserve">解决方案 · 录音转写（whisper）</w:t>
+              <w:t xml:space="preserve">运营 · 公众号一键排版</w:t>
             </w:r>
           </w:p>
         </w:tc>
@@ -749,7 +875,7 @@
           </w:tcPr>
           <w:p>
             <w:r>
-              <w:t xml:space="preserve">❌ 暂不可用</w:t>
+              <w:t xml:space="preserve">✅ 可用</w:t>
             </w:r>
           </w:p>
         </w:tc>
@@ -772,7 +898,14 @@
           </w:tcPr>
           <w:p>
             <w:r>
-              <w:t xml:space="preserve">在 Mac 管理员机转写好 `xx_转写.md`，同步/拷贝过来再用</w:t>
+              <w:t xml:space="preserve">已改用软件内置运行时，</w:t>
+            </w:r>
+            <w:r>
+              <w:rPr>
+                <w:b/>
+                <w:bCs/>
+              </w:rPr>
+              <w:t xml:space="preserve">无需另装 Node.js</w:t>
             </w:r>
           </w:p>
         </w:tc>
@@ -800,7 +933,7 @@
           </w:tcPr>
           <w:p>
             <w:r>
-              <w:t xml:space="preserve">招投标 · 「下载招标文件」自动抓取</w:t>
+              <w:t xml:space="preserve">☁️ 一键同步</w:t>
             </w:r>
           </w:p>
         </w:tc>
@@ -823,7 +956,7 @@
           </w:tcPr>
           <w:p>
             <w:r>
-              <w:t xml:space="preserve">❌ 暂不可用</w:t>
+              <w:t xml:space="preserve">✅ 可用（需装 Git）</w:t>
             </w:r>
           </w:p>
         </w:tc>
@@ -846,7 +979,7 @@
           </w:tcPr>
           <w:p>
             <w:r>
-              <w:t xml:space="preserve">点项目名超链接在浏览器手动下载，再把文件拖进项目 `01_招标文件/`</w:t>
+              <w:t xml:space="preserve">装一次 Git（https://git-scm.com/download/win），远程指内网仓库/Gitee</w:t>
             </w:r>
           </w:p>
         </w:tc>
@@ -874,7 +1007,7 @@
           </w:tcPr>
           <w:p>
             <w:r>
-              <w:t xml:space="preserve">行业情报 · 每日自动抓取</w:t>
+              <w:t xml:space="preserve">解决方案 · 录音转写（whisper）</w:t>
             </w:r>
           </w:p>
         </w:tc>
@@ -897,7 +1030,7 @@
           </w:tcPr>
           <w:p>
             <w:r>
-              <w:t xml:space="preserve">⚠️ 抓取任务在 Mac 管理员机</w:t>
+              <w:t xml:space="preserve">✅ 装了引擎就能用</w:t>
             </w:r>
           </w:p>
         </w:tc>
@@ -920,7 +1053,7 @@
           </w:tcPr>
           <w:p>
             <w:r>
-              <w:t xml:space="preserve">情报数据靠同步过来；Windows 本机不自动抓取</w:t>
+              <w:t xml:space="preserve">需 `pip install openai-whisper` + 安装 ffmpeg 并加入 PATH；未装则提示安装</w:t>
             </w:r>
           </w:p>
         </w:tc>
@@ -948,7 +1081,7 @@
           </w:tcPr>
           <w:p>
             <w:r>
-              <w:t xml:space="preserve">运营 · 公众号一键排版</w:t>
+              <w:t xml:space="preserve">招投标 · 「下载招标文件」自动抓取</w:t>
             </w:r>
           </w:p>
         </w:tc>
@@ -971,7 +1104,7 @@
           </w:tcPr>
           <w:p>
             <w:r>
-              <w:t xml:space="preserve">⚠️ 需本机装 Node.js</w:t>
+              <w:t xml:space="preserve">⚠️ 按设计走手动</w:t>
             </w:r>
           </w:p>
         </w:tc>
@@ -994,7 +1127,81 @@
           </w:tcPr>
           <w:p>
             <w:r>
-              <w:t xml:space="preserve">装了 Node（https://nodejs.org LTS）并在 PATH 里才能用；否则先跳过排版，纯文字直接发</w:t>
+              <w:t xml:space="preserve">依赖政采登录抓取栈（Mac 管理员机就绪）；Windows 点公告链接手动下载后拖进 `01_招标文件/`</w:t>
+            </w:r>
+          </w:p>
+        </w:tc>
+      </w:tr>
+      <w:tr>
+        <w:trPr>
+          <w:tblHeader w:val="false"/>
+        </w:trPr>
+        <w:tc>
+          <w:tcPr>
+            <w:tcW w:type="dxa" w:w="3008"/>
+            <w:tcBorders>
+              <w:top w:val="single" w:color="AAAAAA" w:sz="2"/>
+              <w:left w:val="single" w:color="AAAAAA" w:sz="2"/>
+              <w:bottom w:val="single" w:color="AAAAAA" w:sz="2"/>
+              <w:right w:val="single" w:color="AAAAAA" w:sz="2"/>
+            </w:tcBorders>
+            <w:tcMar>
+              <w:top w:type="dxa" w:w="60"/>
+              <w:left w:type="dxa" w:w="100"/>
+              <w:bottom w:type="dxa" w:w="60"/>
+              <w:right w:type="dxa" w:w="100"/>
+            </w:tcMar>
+            <w:vAlign w:val="center"/>
+          </w:tcPr>
+          <w:p>
+            <w:r>
+              <w:t xml:space="preserve">行业情报 · 每日自动抓取</w:t>
+            </w:r>
+          </w:p>
+        </w:tc>
+        <w:tc>
+          <w:tcPr>
+            <w:tcW w:type="dxa" w:w="3008"/>
+            <w:tcBorders>
+              <w:top w:val="single" w:color="AAAAAA" w:sz="2"/>
+              <w:left w:val="single" w:color="AAAAAA" w:sz="2"/>
+              <w:bottom w:val="single" w:color="AAAAAA" w:sz="2"/>
+              <w:right w:val="single" w:color="AAAAAA" w:sz="2"/>
+            </w:tcBorders>
+            <w:tcMar>
+              <w:top w:type="dxa" w:w="60"/>
+              <w:left w:type="dxa" w:w="100"/>
+              <w:bottom w:type="dxa" w:w="60"/>
+              <w:right w:type="dxa" w:w="100"/>
+            </w:tcMar>
+            <w:vAlign w:val="center"/>
+          </w:tcPr>
+          <w:p>
+            <w:r>
+              <w:t xml:space="preserve">⚠️ 任务在 Mac 管理员机</w:t>
+            </w:r>
+          </w:p>
+        </w:tc>
+        <w:tc>
+          <w:tcPr>
+            <w:tcW w:type="dxa" w:w="3010"/>
+            <w:tcBorders>
+              <w:top w:val="single" w:color="AAAAAA" w:sz="2"/>
+              <w:left w:val="single" w:color="AAAAAA" w:sz="2"/>
+              <w:bottom w:val="single" w:color="AAAAAA" w:sz="2"/>
+              <w:right w:val="single" w:color="AAAAAA" w:sz="2"/>
+            </w:tcBorders>
+            <w:tcMar>
+              <w:top w:type="dxa" w:w="60"/>
+              <w:left w:type="dxa" w:w="100"/>
+              <w:bottom w:type="dxa" w:w="60"/>
+              <w:right w:type="dxa" w:w="100"/>
+            </w:tcMar>
+            <w:vAlign w:val="center"/>
+          </w:tcPr>
+          <w:p>
+            <w:r>
+              <w:t xml:space="preserve">情报数据靠同步过来；Windows 本机不自动抓取</w:t>
             </w:r>
           </w:p>
         </w:tc>
@@ -1023,7 +1230,7 @@
         <w:pStyle w:val="ListParagraph"/>
         <w:numPr>
           <w:ilvl w:val="0"/>
-          <w:numId w:val="3"/>
+          <w:numId w:val="2"/>
         </w:numPr>
       </w:pPr>
       <w:r>
@@ -1035,7 +1242,7 @@
         <w:pStyle w:val="ListParagraph"/>
         <w:numPr>
           <w:ilvl w:val="0"/>
-          <w:numId w:val="3"/>
+          <w:numId w:val="2"/>
         </w:numPr>
       </w:pPr>
       <w:r>
@@ -1047,7 +1254,7 @@
         <w:pStyle w:val="ListParagraph"/>
         <w:numPr>
           <w:ilvl w:val="0"/>
-          <w:numId w:val="3"/>
+          <w:numId w:val="2"/>
         </w:numPr>
       </w:pPr>
       <w:r>
@@ -1069,7 +1276,7 @@
         <w:pStyle w:val="ListParagraph"/>
         <w:numPr>
           <w:ilvl w:val="0"/>
-          <w:numId w:val="3"/>
+          <w:numId w:val="2"/>
         </w:numPr>
       </w:pPr>
       <w:r>
@@ -1081,19 +1288,19 @@
         <w:pStyle w:val="ListParagraph"/>
         <w:numPr>
           <w:ilvl w:val="0"/>
-          <w:numId w:val="3"/>
-        </w:numPr>
-      </w:pPr>
-      <w:r>
-        <w:t xml:space="preserve">运营 / 品牌 / 行政人力 / 财务：对话式生成与产出；</w:t>
-      </w:r>
-    </w:p>
-    <w:p>
-      <w:pPr>
-        <w:pStyle w:val="ListParagraph"/>
-        <w:numPr>
-          <w:ilvl w:val="0"/>
-          <w:numId w:val="3"/>
+          <w:numId w:val="2"/>
+        </w:numPr>
+      </w:pPr>
+      <w:r>
+        <w:t xml:space="preserve">运营 / 品牌 / 行政人力 / 财务：对话式生成与产出，公众号一键排版；</w:t>
+      </w:r>
+    </w:p>
+    <w:p>
+      <w:pPr>
+        <w:pStyle w:val="ListParagraph"/>
+        <w:numPr>
+          <w:ilvl w:val="0"/>
+          <w:numId w:val="2"/>
         </w:numPr>
       </w:pPr>
       <w:r>
@@ -1115,7 +1322,7 @@
           <w:i/>
           <w:iCs/>
         </w:rPr>
-        <w:t xml:space="preserve">想把上面几项也做成 Windows 可用（转写、招标自动下载、公众号排版免装 Node 等），告诉我，可以再排一次开发。</w:t>
+        <w:t xml:space="preserve">招标文件自动下载在 Windows 上按设计走手动（成员机通常没有政采抓取环境）。若确有需要在某台 Windows 上启用自动下载，联系管理员单独配置。</w:t>
       </w:r>
     </w:p>
     <w:p/>
@@ -1444,7 +1651,7 @@
           </w:tcPr>
           <w:p>
             <w:r>
-              <w:t xml:space="preserve">录音转写 / 下载招标文件点了没反应</w:t>
+              <w:t xml:space="preserve">录音转写点了提示装引擎</w:t>
             </w:r>
           </w:p>
         </w:tc>
@@ -1467,7 +1674,58 @@
           </w:tcPr>
           <w:p>
             <w:r>
-              <w:t xml:space="preserve">见第五节——这两项 Windows 暂不支持，按替代方案操作。</w:t>
+              <w:t xml:space="preserve">按提示 `pip install openai-whisper` 并装 ffmpeg 加入 PATH；装好重开软件即可。</w:t>
+            </w:r>
+          </w:p>
+        </w:tc>
+      </w:tr>
+      <w:tr>
+        <w:trPr>
+          <w:tblHeader w:val="false"/>
+        </w:trPr>
+        <w:tc>
+          <w:tcPr>
+            <w:tcW w:type="dxa" w:w="4513"/>
+            <w:tcBorders>
+              <w:top w:val="single" w:color="AAAAAA" w:sz="2"/>
+              <w:left w:val="single" w:color="AAAAAA" w:sz="2"/>
+              <w:bottom w:val="single" w:color="AAAAAA" w:sz="2"/>
+              <w:right w:val="single" w:color="AAAAAA" w:sz="2"/>
+            </w:tcBorders>
+            <w:tcMar>
+              <w:top w:type="dxa" w:w="60"/>
+              <w:left w:type="dxa" w:w="100"/>
+              <w:bottom w:type="dxa" w:w="60"/>
+              <w:right w:type="dxa" w:w="100"/>
+            </w:tcMar>
+            <w:vAlign w:val="center"/>
+          </w:tcPr>
+          <w:p>
+            <w:r>
+              <w:t xml:space="preserve">下载招标文件走手动</w:t>
+            </w:r>
+          </w:p>
+        </w:tc>
+        <w:tc>
+          <w:tcPr>
+            <w:tcW w:type="dxa" w:w="4513"/>
+            <w:tcBorders>
+              <w:top w:val="single" w:color="AAAAAA" w:sz="2"/>
+              <w:left w:val="single" w:color="AAAAAA" w:sz="2"/>
+              <w:bottom w:val="single" w:color="AAAAAA" w:sz="2"/>
+              <w:right w:val="single" w:color="AAAAAA" w:sz="2"/>
+            </w:tcBorders>
+            <w:tcMar>
+              <w:top w:type="dxa" w:w="60"/>
+              <w:left w:type="dxa" w:w="100"/>
+              <w:bottom w:type="dxa" w:w="60"/>
+              <w:right w:type="dxa" w:w="100"/>
+            </w:tcMar>
+            <w:vAlign w:val="center"/>
+          </w:tcPr>
+          <w:p>
+            <w:r>
+              <w:t xml:space="preserve">Windows 上按设计走手动：点公告链接下载后拖进项目 `01_招标文件/`。</w:t>
             </w:r>
           </w:p>
         </w:tc>
@@ -1701,13 +1959,13 @@
     </w:lvlOverride>
   </w:num>
   <w:num w:numId="2">
-    <w:abstractNumId w:val="3"/>
+    <w:abstractNumId w:val="2"/>
     <w:lvlOverride w:ilvl="0">
       <w:startOverride w:val="1"/>
     </w:lvlOverride>
   </w:num>
   <w:num w:numId="3">
-    <w:abstractNumId w:val="2"/>
+    <w:abstractNumId w:val="3"/>
     <w:lvlOverride w:ilvl="0">
       <w:startOverride w:val="1"/>
     </w:lvlOverride>

</xml_diff>